<commit_message>
7.36.3 (informe) — el informe anota que los tres hallazgos quedaron corregidos
El DOCX se regenera con el estado de cada defecto: los tres se arreglaron a
pedido del usuario una vez cerrada la corrida y se verificaron contra la propia
base de la simulacion, que es la que los produjo.

Co-Authored-By: Claude Opus 5 <noreply@anthropic.com>
</commit_message>
<xml_diff>
--- a/Informe_QA_Simulacion_Intensiva_1_Mes_SPGLaravel.docx
+++ b/Informe_QA_Simulacion_Intensiva_1_Mes_SPGLaravel.docx
@@ -29234,16 +29234,18 @@
           <w:sz w:val="19"/>
           <w:szCs w:val="19"/>
         </w:rPr>
-        <w:t xml:space="preserve">Cómo reproducirlo. </w:t>
-      </w:r>
-      <w:r>
-        <w:rPr>
-          <w:rFonts w:ascii="Calibri" w:cs="Calibri" w:eastAsia="Calibri" w:hAnsi="Calibri"/>
-          <w:color w:val="3A3733"/>
+        <w:t xml:space="preserve">Estado. </w:t>
+      </w:r>
+      <w:r>
+        <w:rPr>
+          <w:rFonts w:ascii="Calibri" w:cs="Calibri" w:eastAsia="Calibri" w:hAnsi="Calibri"/>
+          <w:b/>
+          <w:bCs/>
+          <w:color w:val="2F5D2F"/>
           <w:sz w:val="19"/>
           <w:szCs w:val="19"/>
         </w:rPr>
-        <w:t xml:space="preserve">Entrar con cualquier cuenta con permiso `inventario.compras`, elegir sucursal y abrir Inventario → Compras → Nueva compra. Error de MariaDB 1054: «Unknown column 'producto.id_sucursal' in 'where clause'».</w:t>
+        <w:t xml:space="preserve">CORREGIDO en 7.36.3 — «Nueva compra» vuelve a dibujarse (HTTP 200), verificado contra la base de la simulación. Entra a la lista de pantallas que la batería abre, que es donde faltaba.</w:t>
       </w:r>
     </w:p>
     <w:p>
@@ -29259,6 +29261,31 @@
           <w:sz w:val="19"/>
           <w:szCs w:val="19"/>
         </w:rPr>
+        <w:t xml:space="preserve">Cómo reproducirlo. </w:t>
+      </w:r>
+      <w:r>
+        <w:rPr>
+          <w:rFonts w:ascii="Calibri" w:cs="Calibri" w:eastAsia="Calibri" w:hAnsi="Calibri"/>
+          <w:color w:val="3A3733"/>
+          <w:sz w:val="19"/>
+          <w:szCs w:val="19"/>
+        </w:rPr>
+        <w:t xml:space="preserve">Entrar con cualquier cuenta con permiso `inventario.compras`, elegir sucursal y abrir Inventario → Compras → Nueva compra. Error de MariaDB 1054: «Unknown column 'producto.id_sucursal' in 'where clause'».</w:t>
+      </w:r>
+    </w:p>
+    <w:p>
+      <w:pPr>
+        <w:spacing w:after="110" w:line="278"/>
+      </w:pPr>
+      <w:r>
+        <w:rPr>
+          <w:rFonts w:ascii="Calibri" w:cs="Calibri" w:eastAsia="Calibri" w:hAnsi="Calibri"/>
+          <w:b/>
+          <w:bCs/>
+          <w:color w:val="3A3733"/>
+          <w:sz w:val="19"/>
+          <w:szCs w:val="19"/>
+        </w:rPr>
         <w:t xml:space="preserve">Impacto. </w:t>
       </w:r>
       <w:r>
@@ -29446,16 +29473,18 @@
           <w:sz w:val="19"/>
           <w:szCs w:val="19"/>
         </w:rPr>
-        <w:t xml:space="preserve">Cómo reproducirlo. </w:t>
-      </w:r>
-      <w:r>
-        <w:rPr>
-          <w:rFonts w:ascii="Calibri" w:cs="Calibri" w:eastAsia="Calibri" w:hAnsi="Calibri"/>
-          <w:color w:val="3A3733"/>
+        <w:t xml:space="preserve">Estado. </w:t>
+      </w:r>
+      <w:r>
+        <w:rPr>
+          <w:rFonts w:ascii="Calibri" w:cs="Calibri" w:eastAsia="Calibri" w:hAnsi="Calibri"/>
+          <w:b/>
+          <w:bCs/>
+          <w:color w:val="2F5D2F"/>
           <w:sz w:val="19"/>
           <w:szCs w:val="19"/>
         </w:rPr>
-        <w:t xml:space="preserve">Una cuenta asignada a dos sucursales abre la caja en ambas. Trabajando en el local con más efectivo, registrar un pago a proveedor en efectivo mayor al saldo del OTRO local. Evidencia: caja #19 (sucursal 2), monto inicial Gs. 150.000, pago a proveedor #2 en efectivo por Gs. 1.150.000 aplicado, saldo final Gs. -1.000.000.</w:t>
+        <w:t xml:space="preserve">CORREGIDO en 7.36.3 — las tres rutinas deducen la sucursal de su propio documento. Verificado: con dos cajas abiertas por la misma persona, la seña entró a la del local de la cita y no a la abierta después en el otro.</w:t>
       </w:r>
     </w:p>
     <w:p>
@@ -29471,6 +29500,31 @@
           <w:sz w:val="19"/>
           <w:szCs w:val="19"/>
         </w:rPr>
+        <w:t xml:space="preserve">Cómo reproducirlo. </w:t>
+      </w:r>
+      <w:r>
+        <w:rPr>
+          <w:rFonts w:ascii="Calibri" w:cs="Calibri" w:eastAsia="Calibri" w:hAnsi="Calibri"/>
+          <w:color w:val="3A3733"/>
+          <w:sz w:val="19"/>
+          <w:szCs w:val="19"/>
+        </w:rPr>
+        <w:t xml:space="preserve">Una cuenta asignada a dos sucursales abre la caja en ambas. Trabajando en el local con más efectivo, registrar un pago a proveedor en efectivo mayor al saldo del OTRO local. Evidencia: caja #19 (sucursal 2), monto inicial Gs. 150.000, pago a proveedor #2 en efectivo por Gs. 1.150.000 aplicado, saldo final Gs. -1.000.000.</w:t>
+      </w:r>
+    </w:p>
+    <w:p>
+      <w:pPr>
+        <w:spacing w:after="110" w:line="278"/>
+      </w:pPr>
+      <w:r>
+        <w:rPr>
+          <w:rFonts w:ascii="Calibri" w:cs="Calibri" w:eastAsia="Calibri" w:hAnsi="Calibri"/>
+          <w:b/>
+          <w:bCs/>
+          <w:color w:val="3A3733"/>
+          <w:sz w:val="19"/>
+          <w:szCs w:val="19"/>
+        </w:rPr>
         <w:t xml:space="preserve">Impacto. </w:t>
       </w:r>
       <w:r>
@@ -29643,6 +29697,33 @@
           <w:szCs w:val="19"/>
         </w:rPr>
         <w:t xml:space="preserve">Consecuencia esperable de la 7.33.0, con el mensaje incompleto.</w:t>
+      </w:r>
+    </w:p>
+    <w:p>
+      <w:pPr>
+        <w:spacing w:after="110" w:line="278"/>
+      </w:pPr>
+      <w:r>
+        <w:rPr>
+          <w:rFonts w:ascii="Calibri" w:cs="Calibri" w:eastAsia="Calibri" w:hAnsi="Calibri"/>
+          <w:b/>
+          <w:bCs/>
+          <w:color w:val="3A3733"/>
+          <w:sz w:val="19"/>
+          <w:szCs w:val="19"/>
+        </w:rPr>
+        <w:t xml:space="preserve">Estado. </w:t>
+      </w:r>
+      <w:r>
+        <w:rPr>
+          <w:rFonts w:ascii="Calibri" w:cs="Calibri" w:eastAsia="Calibri" w:hAnsi="Calibri"/>
+          <w:b/>
+          <w:bCs/>
+          <w:color w:val="2F5D2F"/>
+          <w:sz w:val="19"/>
+          <w:szCs w:val="19"/>
+        </w:rPr>
+        <w:t xml:space="preserve">CORREGIDO en 7.36.3 — el aviso ya no dice «no hay stock»: nombra el camino para traer el producto a la sucursal.</w:t>
       </w:r>
     </w:p>
     <w:p>
@@ -30278,6 +30359,24 @@
           <w:szCs w:val="19"/>
         </w:rPr>
         <w:t xml:space="preserve">· La caja del local nuevo no abría por CJ-04, corregido durante la corrida a pedido del usuario (versión 7.36.2) para que el multisucursal pudiera probarse de verdad.</w:t>
+      </w:r>
+    </w:p>
+    <w:p>
+      <w:pPr>
+        <w:spacing w:after="110" w:before="0" w:line="278"/>
+      </w:pPr>
+      <w:r>
+        <w:rPr>
+          <w:rFonts w:ascii="Calibri" w:cs="Calibri" w:eastAsia="Calibri" w:hAnsi="Calibri"/>
+          <w:b w:val="false"/>
+          <w:bCs w:val="false"/>
+          <w:i w:val="false"/>
+          <w:iCs w:val="false"/>
+          <w:color w:val="3A3733"/>
+          <w:sz w:val="19"/>
+          <w:szCs w:val="19"/>
+        </w:rPr>
+        <w:t xml:space="preserve">· Los tres hallazgos se corrigieron a pedido del usuario una vez cerrada la corrida (versión 7.36.3) y se verificaron contra la propia base de la simulación. La batería pasa de 89 a 91 pruebas.</w:t>
       </w:r>
     </w:p>
     <w:p>

</xml_diff>